<commit_message>
Align the English menu with the Chinese site and fix footer overlap.
Hide 新網頁, extra About items, Search, and More. Translate every dropdown line. Keep LINE and the privacy text in separate columns.

Co-authored-by: jackiechow4567-arch <jackiechow4567-arch@users.noreply.github.com>
</commit_message>
<xml_diff>
--- a/samples/mpnicare-hk-locale/word/MPNicare-EN-wording-change-log.docx
+++ b/samples/mpnicare-hk-locale/word/MPNicare-EN-wording-change-log.docx
@@ -101,7 +101,617 @@
           <w:color w:val="12353A"/>
           <w:sz w:val="32"/>
         </w:rPr>
-        <w:t>2. 必須改掉的錯誤（臨床／品牌）</w:t>
+        <w:t>2. 選單必須與中文版同一結構</w:t>
+      </w:r>
+    </w:p>
+    <w:p>
+      <w:pPr>
+        <w:spacing w:after="160"/>
+      </w:pPr>
+      <w:r>
+        <w:rPr>
+          <w:rFonts w:ascii="Calibri" w:hAnsi="Calibri" w:eastAsia="Microsoft JhengHei"/>
+          <w:b w:val="0"/>
+          <w:sz w:val="22"/>
+        </w:rPr>
+        <w:t>中文版頂層只有 7 項：首頁、關於MPN▾、衛教專區▾、血腫專欄、健康照護、品味生活、友善連結。英文版多了「新網頁」（報名系統）、兩個「關於」、搜尋結果，標籤又較長，Wix 才出現 More，More 裡再堆兩個中文「關於」。</w:t>
+      </w:r>
+    </w:p>
+    <w:tbl>
+      <w:tblPr>
+        <w:tblStyle w:val="TableGrid"/>
+        <w:tblW w:type="auto" w:w="0"/>
+        <w:jc w:val="center"/>
+        <w:tblLook w:firstColumn="1" w:firstRow="1" w:lastColumn="0" w:lastRow="0" w:noHBand="0" w:noVBand="1" w:val="04A0"/>
+      </w:tblPr>
+      <w:tblGrid>
+        <w:gridCol w:w="3324"/>
+        <w:gridCol w:w="3324"/>
+        <w:gridCol w:w="3324"/>
+      </w:tblGrid>
+      <w:tr>
+        <w:tc>
+          <w:tcPr>
+            <w:tcW w:type="dxa" w:w="3118"/>
+            <w:shd w:fill="12353A"/>
+          </w:tcPr>
+          <w:p>
+            <w:r/>
+            <w:r>
+              <w:rPr>
+                <w:rFonts w:ascii="Calibri" w:hAnsi="Calibri" w:eastAsia="Microsoft JhengHei"/>
+                <w:b/>
+                <w:color w:val="FFFFFF"/>
+                <w:sz w:val="20"/>
+              </w:rPr>
+              <w:t>中文版（準則）</w:t>
+            </w:r>
+          </w:p>
+        </w:tc>
+        <w:tc>
+          <w:tcPr>
+            <w:tcW w:type="dxa" w:w="3685"/>
+            <w:shd w:fill="12353A"/>
+          </w:tcPr>
+          <w:p>
+            <w:r/>
+            <w:r>
+              <w:rPr>
+                <w:rFonts w:ascii="Calibri" w:hAnsi="Calibri" w:eastAsia="Microsoft JhengHei"/>
+                <w:b/>
+                <w:color w:val="FFFFFF"/>
+                <w:sz w:val="20"/>
+              </w:rPr>
+              <w:t>現有 /en（不要保留）</w:t>
+            </w:r>
+          </w:p>
+        </w:tc>
+        <w:tc>
+          <w:tcPr>
+            <w:tcW w:type="dxa" w:w="2835"/>
+            <w:shd w:fill="12353A"/>
+          </w:tcPr>
+          <w:p>
+            <w:r/>
+            <w:r>
+              <w:rPr>
+                <w:rFonts w:ascii="Calibri" w:hAnsi="Calibri" w:eastAsia="Microsoft JhengHei"/>
+                <w:b/>
+                <w:color w:val="FFFFFF"/>
+                <w:sz w:val="20"/>
+              </w:rPr>
+              <w:t>建議英文</w:t>
+            </w:r>
+          </w:p>
+        </w:tc>
+      </w:tr>
+      <w:tr>
+        <w:tc>
+          <w:tcPr>
+            <w:tcW w:type="dxa" w:w="3118"/>
+          </w:tcPr>
+          <w:p>
+            <w:r/>
+            <w:r>
+              <w:rPr>
+                <w:rFonts w:ascii="Calibri" w:hAnsi="Calibri" w:eastAsia="Microsoft JhengHei"/>
+                <w:b w:val="0"/>
+                <w:sz w:val="20"/>
+              </w:rPr>
+              <w:t>首頁</w:t>
+            </w:r>
+          </w:p>
+        </w:tc>
+        <w:tc>
+          <w:tcPr>
+            <w:tcW w:type="dxa" w:w="3685"/>
+          </w:tcPr>
+          <w:p>
+            <w:r/>
+            <w:r>
+              <w:rPr>
+                <w:rFonts w:ascii="Calibri" w:hAnsi="Calibri" w:eastAsia="Microsoft JhengHei"/>
+                <w:b w:val="0"/>
+                <w:sz w:val="20"/>
+              </w:rPr>
+              <w:t>front page</w:t>
+            </w:r>
+          </w:p>
+        </w:tc>
+        <w:tc>
+          <w:tcPr>
+            <w:tcW w:type="dxa" w:w="2835"/>
+          </w:tcPr>
+          <w:p>
+            <w:r/>
+            <w:r>
+              <w:rPr>
+                <w:rFonts w:ascii="Calibri" w:hAnsi="Calibri" w:eastAsia="Microsoft JhengHei"/>
+                <w:b w:val="0"/>
+                <w:sz w:val="20"/>
+              </w:rPr>
+              <w:t>Home</w:t>
+            </w:r>
+          </w:p>
+        </w:tc>
+      </w:tr>
+      <w:tr>
+        <w:tc>
+          <w:tcPr>
+            <w:tcW w:type="dxa" w:w="3118"/>
+          </w:tcPr>
+          <w:p>
+            <w:r/>
+            <w:r>
+              <w:rPr>
+                <w:rFonts w:ascii="Calibri" w:hAnsi="Calibri" w:eastAsia="Microsoft JhengHei"/>
+                <w:b w:val="0"/>
+                <w:sz w:val="20"/>
+              </w:rPr>
+              <w:t>（無此項）</w:t>
+            </w:r>
+          </w:p>
+        </w:tc>
+        <w:tc>
+          <w:tcPr>
+            <w:tcW w:type="dxa" w:w="3685"/>
+          </w:tcPr>
+          <w:p>
+            <w:r/>
+            <w:r>
+              <w:rPr>
+                <w:rFonts w:ascii="Calibri" w:hAnsi="Calibri" w:eastAsia="Microsoft JhengHei"/>
+                <w:b w:val="0"/>
+                <w:sz w:val="20"/>
+              </w:rPr>
+              <w:t>新網頁 → /en/報名系統</w:t>
+            </w:r>
+          </w:p>
+        </w:tc>
+        <w:tc>
+          <w:tcPr>
+            <w:tcW w:type="dxa" w:w="2835"/>
+          </w:tcPr>
+          <w:p>
+            <w:r/>
+            <w:r>
+              <w:rPr>
+                <w:rFonts w:ascii="Calibri" w:hAnsi="Calibri" w:eastAsia="Microsoft JhengHei"/>
+                <w:b w:val="0"/>
+                <w:sz w:val="20"/>
+              </w:rPr>
+              <w:t>刪除，不要出現在選單</w:t>
+            </w:r>
+          </w:p>
+        </w:tc>
+      </w:tr>
+      <w:tr>
+        <w:tc>
+          <w:tcPr>
+            <w:tcW w:type="dxa" w:w="3118"/>
+          </w:tcPr>
+          <w:p>
+            <w:r/>
+            <w:r>
+              <w:rPr>
+                <w:rFonts w:ascii="Calibri" w:hAnsi="Calibri" w:eastAsia="Microsoft JhengHei"/>
+                <w:b w:val="0"/>
+                <w:sz w:val="20"/>
+              </w:rPr>
+              <w:t>關於MPN▾（5 個中文下拉）</w:t>
+            </w:r>
+          </w:p>
+        </w:tc>
+        <w:tc>
+          <w:tcPr>
+            <w:tcW w:type="dxa" w:w="3685"/>
+          </w:tcPr>
+          <w:p>
+            <w:r/>
+            <w:r>
+              <w:rPr>
+                <w:rFonts w:ascii="Calibri" w:hAnsi="Calibri" w:eastAsia="Microsoft JhengHei"/>
+                <w:b w:val="0"/>
+                <w:sz w:val="20"/>
+              </w:rPr>
+              <w:t>關於MPN（下拉仍全中文）</w:t>
+            </w:r>
+          </w:p>
+        </w:tc>
+        <w:tc>
+          <w:tcPr>
+            <w:tcW w:type="dxa" w:w="2835"/>
+          </w:tcPr>
+          <w:p>
+            <w:r/>
+            <w:r>
+              <w:rPr>
+                <w:rFonts w:ascii="Calibri" w:hAnsi="Calibri" w:eastAsia="Microsoft JhengHei"/>
+                <w:b w:val="0"/>
+                <w:sz w:val="20"/>
+              </w:rPr>
+              <w:t>About MPN▾ + 5 個英文下拉</w:t>
+            </w:r>
+          </w:p>
+        </w:tc>
+      </w:tr>
+      <w:tr>
+        <w:tc>
+          <w:tcPr>
+            <w:tcW w:type="dxa" w:w="3118"/>
+          </w:tcPr>
+          <w:p>
+            <w:r/>
+            <w:r>
+              <w:rPr>
+                <w:rFonts w:ascii="Calibri" w:hAnsi="Calibri" w:eastAsia="Microsoft JhengHei"/>
+                <w:b w:val="0"/>
+                <w:sz w:val="20"/>
+              </w:rPr>
+              <w:t>衛教專區▾（4 個中文下拉）</w:t>
+            </w:r>
+          </w:p>
+        </w:tc>
+        <w:tc>
+          <w:tcPr>
+            <w:tcW w:type="dxa" w:w="3685"/>
+          </w:tcPr>
+          <w:p>
+            <w:r/>
+            <w:r>
+              <w:rPr>
+                <w:rFonts w:ascii="Calibri" w:hAnsi="Calibri" w:eastAsia="Microsoft JhengHei"/>
+                <w:b w:val="0"/>
+                <w:sz w:val="20"/>
+              </w:rPr>
+              <w:t>關於 + 副本 副本 衛教手冊…</w:t>
+            </w:r>
+          </w:p>
+        </w:tc>
+        <w:tc>
+          <w:tcPr>
+            <w:tcW w:type="dxa" w:w="2835"/>
+          </w:tcPr>
+          <w:p>
+            <w:r/>
+            <w:r>
+              <w:rPr>
+                <w:rFonts w:ascii="Calibri" w:hAnsi="Calibri" w:eastAsia="Microsoft JhengHei"/>
+                <w:b w:val="0"/>
+                <w:sz w:val="20"/>
+              </w:rPr>
+              <w:t>Patient education▾ + 4 個英文下拉</w:t>
+            </w:r>
+          </w:p>
+        </w:tc>
+      </w:tr>
+      <w:tr>
+        <w:tc>
+          <w:tcPr>
+            <w:tcW w:type="dxa" w:w="3118"/>
+          </w:tcPr>
+          <w:p>
+            <w:r/>
+            <w:r>
+              <w:rPr>
+                <w:rFonts w:ascii="Calibri" w:hAnsi="Calibri" w:eastAsia="Microsoft JhengHei"/>
+                <w:b w:val="0"/>
+                <w:sz w:val="20"/>
+              </w:rPr>
+              <w:t>血腫專欄</w:t>
+            </w:r>
+          </w:p>
+        </w:tc>
+        <w:tc>
+          <w:tcPr>
+            <w:tcW w:type="dxa" w:w="3685"/>
+          </w:tcPr>
+          <w:p>
+            <w:r/>
+            <w:r>
+              <w:rPr>
+                <w:rFonts w:ascii="Calibri" w:hAnsi="Calibri" w:eastAsia="Microsoft JhengHei"/>
+                <w:b w:val="0"/>
+                <w:sz w:val="20"/>
+              </w:rPr>
+              <w:t>Hematoma column</w:t>
+            </w:r>
+          </w:p>
+        </w:tc>
+        <w:tc>
+          <w:tcPr>
+            <w:tcW w:type="dxa" w:w="2835"/>
+          </w:tcPr>
+          <w:p>
+            <w:r/>
+            <w:r>
+              <w:rPr>
+                <w:rFonts w:ascii="Calibri" w:hAnsi="Calibri" w:eastAsia="Microsoft JhengHei"/>
+                <w:b w:val="0"/>
+                <w:sz w:val="20"/>
+              </w:rPr>
+              <w:t>Hematology</w:t>
+            </w:r>
+          </w:p>
+        </w:tc>
+      </w:tr>
+      <w:tr>
+        <w:tc>
+          <w:tcPr>
+            <w:tcW w:type="dxa" w:w="3118"/>
+          </w:tcPr>
+          <w:p>
+            <w:r/>
+            <w:r>
+              <w:rPr>
+                <w:rFonts w:ascii="Calibri" w:hAnsi="Calibri" w:eastAsia="Microsoft JhengHei"/>
+                <w:b w:val="0"/>
+                <w:sz w:val="20"/>
+              </w:rPr>
+              <w:t>健康照護</w:t>
+            </w:r>
+          </w:p>
+        </w:tc>
+        <w:tc>
+          <w:tcPr>
+            <w:tcW w:type="dxa" w:w="3685"/>
+          </w:tcPr>
+          <w:p>
+            <w:r/>
+            <w:r>
+              <w:rPr>
+                <w:rFonts w:ascii="Calibri" w:hAnsi="Calibri" w:eastAsia="Microsoft JhengHei"/>
+                <w:b w:val="0"/>
+                <w:sz w:val="20"/>
+              </w:rPr>
+              <w:t>health care</w:t>
+            </w:r>
+          </w:p>
+        </w:tc>
+        <w:tc>
+          <w:tcPr>
+            <w:tcW w:type="dxa" w:w="2835"/>
+          </w:tcPr>
+          <w:p>
+            <w:r/>
+            <w:r>
+              <w:rPr>
+                <w:rFonts w:ascii="Calibri" w:hAnsi="Calibri" w:eastAsia="Microsoft JhengHei"/>
+                <w:b w:val="0"/>
+                <w:sz w:val="20"/>
+              </w:rPr>
+              <w:t>Health information</w:t>
+            </w:r>
+          </w:p>
+        </w:tc>
+      </w:tr>
+      <w:tr>
+        <w:tc>
+          <w:tcPr>
+            <w:tcW w:type="dxa" w:w="3118"/>
+          </w:tcPr>
+          <w:p>
+            <w:r/>
+            <w:r>
+              <w:rPr>
+                <w:rFonts w:ascii="Calibri" w:hAnsi="Calibri" w:eastAsia="Microsoft JhengHei"/>
+                <w:b w:val="0"/>
+                <w:sz w:val="20"/>
+              </w:rPr>
+              <w:t>品味生活</w:t>
+            </w:r>
+          </w:p>
+        </w:tc>
+        <w:tc>
+          <w:tcPr>
+            <w:tcW w:type="dxa" w:w="3685"/>
+          </w:tcPr>
+          <w:p>
+            <w:r/>
+            <w:r>
+              <w:rPr>
+                <w:rFonts w:ascii="Calibri" w:hAnsi="Calibri" w:eastAsia="Microsoft JhengHei"/>
+                <w:b w:val="0"/>
+                <w:sz w:val="20"/>
+              </w:rPr>
+              <w:t>Lifestyle</w:t>
+            </w:r>
+          </w:p>
+        </w:tc>
+        <w:tc>
+          <w:tcPr>
+            <w:tcW w:type="dxa" w:w="2835"/>
+          </w:tcPr>
+          <w:p>
+            <w:r/>
+            <w:r>
+              <w:rPr>
+                <w:rFonts w:ascii="Calibri" w:hAnsi="Calibri" w:eastAsia="Microsoft JhengHei"/>
+                <w:b w:val="0"/>
+                <w:sz w:val="20"/>
+              </w:rPr>
+              <w:t>Lifestyle</w:t>
+            </w:r>
+          </w:p>
+        </w:tc>
+      </w:tr>
+      <w:tr>
+        <w:tc>
+          <w:tcPr>
+            <w:tcW w:type="dxa" w:w="3118"/>
+          </w:tcPr>
+          <w:p>
+            <w:r/>
+            <w:r>
+              <w:rPr>
+                <w:rFonts w:ascii="Calibri" w:hAnsi="Calibri" w:eastAsia="Microsoft JhengHei"/>
+                <w:b w:val="0"/>
+                <w:sz w:val="20"/>
+              </w:rPr>
+              <w:t>友善連結</w:t>
+            </w:r>
+          </w:p>
+        </w:tc>
+        <w:tc>
+          <w:tcPr>
+            <w:tcW w:type="dxa" w:w="3685"/>
+          </w:tcPr>
+          <w:p>
+            <w:r/>
+            <w:r>
+              <w:rPr>
+                <w:rFonts w:ascii="Calibri" w:hAnsi="Calibri" w:eastAsia="Microsoft JhengHei"/>
+                <w:b w:val="0"/>
+                <w:sz w:val="20"/>
+              </w:rPr>
+              <w:t>關於（連到 about-4）</w:t>
+            </w:r>
+          </w:p>
+        </w:tc>
+        <w:tc>
+          <w:tcPr>
+            <w:tcW w:type="dxa" w:w="2835"/>
+          </w:tcPr>
+          <w:p>
+            <w:r/>
+            <w:r>
+              <w:rPr>
+                <w:rFonts w:ascii="Calibri" w:hAnsi="Calibri" w:eastAsia="Microsoft JhengHei"/>
+                <w:b w:val="0"/>
+                <w:sz w:val="20"/>
+              </w:rPr>
+              <w:t>Useful links</w:t>
+            </w:r>
+          </w:p>
+        </w:tc>
+      </w:tr>
+      <w:tr>
+        <w:tc>
+          <w:tcPr>
+            <w:tcW w:type="dxa" w:w="3118"/>
+          </w:tcPr>
+          <w:p>
+            <w:r/>
+            <w:r>
+              <w:rPr>
+                <w:rFonts w:ascii="Calibri" w:hAnsi="Calibri" w:eastAsia="Microsoft JhengHei"/>
+                <w:b w:val="0"/>
+                <w:sz w:val="20"/>
+              </w:rPr>
+              <w:t>（條款只在頁尾）</w:t>
+            </w:r>
+          </w:p>
+        </w:tc>
+        <w:tc>
+          <w:tcPr>
+            <w:tcW w:type="dxa" w:w="3685"/>
+          </w:tcPr>
+          <w:p>
+            <w:r/>
+            <w:r>
+              <w:rPr>
+                <w:rFonts w:ascii="Calibri" w:hAnsi="Calibri" w:eastAsia="Microsoft JhengHei"/>
+                <w:b w:val="0"/>
+                <w:sz w:val="20"/>
+              </w:rPr>
+              <w:t>關於（連到 about-5 條款）</w:t>
+            </w:r>
+          </w:p>
+        </w:tc>
+        <w:tc>
+          <w:tcPr>
+            <w:tcW w:type="dxa" w:w="2835"/>
+          </w:tcPr>
+          <w:p>
+            <w:r/>
+            <w:r>
+              <w:rPr>
+                <w:rFonts w:ascii="Calibri" w:hAnsi="Calibri" w:eastAsia="Microsoft JhengHei"/>
+                <w:b w:val="0"/>
+                <w:sz w:val="20"/>
+              </w:rPr>
+              <w:t>刪除選單項；條款留在頁尾</w:t>
+            </w:r>
+          </w:p>
+        </w:tc>
+      </w:tr>
+      <w:tr>
+        <w:tc>
+          <w:tcPr>
+            <w:tcW w:type="dxa" w:w="3118"/>
+          </w:tcPr>
+          <w:p>
+            <w:r/>
+            <w:r>
+              <w:rPr>
+                <w:rFonts w:ascii="Calibri" w:hAnsi="Calibri" w:eastAsia="Microsoft JhengHei"/>
+                <w:b w:val="0"/>
+                <w:sz w:val="20"/>
+              </w:rPr>
+              <w:t>（無搜尋項）</w:t>
+            </w:r>
+          </w:p>
+        </w:tc>
+        <w:tc>
+          <w:tcPr>
+            <w:tcW w:type="dxa" w:w="3685"/>
+          </w:tcPr>
+          <w:p>
+            <w:r/>
+            <w:r>
+              <w:rPr>
+                <w:rFonts w:ascii="Calibri" w:hAnsi="Calibri" w:eastAsia="Microsoft JhengHei"/>
+                <w:b w:val="0"/>
+                <w:sz w:val="20"/>
+              </w:rPr>
+              <w:t>搜尋結果 + More</w:t>
+            </w:r>
+          </w:p>
+        </w:tc>
+        <w:tc>
+          <w:tcPr>
+            <w:tcW w:type="dxa" w:w="2835"/>
+          </w:tcPr>
+          <w:p>
+            <w:r/>
+            <w:r>
+              <w:rPr>
+                <w:rFonts w:ascii="Calibri" w:hAnsi="Calibri" w:eastAsia="Microsoft JhengHei"/>
+                <w:b w:val="0"/>
+                <w:sz w:val="20"/>
+              </w:rPr>
+              <w:t>刪除</w:t>
+            </w:r>
+          </w:p>
+        </w:tc>
+      </w:tr>
+    </w:tbl>
+    <w:p/>
+    <w:p>
+      <w:pPr>
+        <w:spacing w:after="160"/>
+      </w:pPr>
+      <w:r>
+        <w:rPr>
+          <w:rFonts w:ascii="Calibri" w:hAnsi="Calibri" w:eastAsia="Microsoft JhengHei"/>
+          <w:b w:val="0"/>
+          <w:sz w:val="22"/>
+        </w:rPr>
+        <w:t>Wix 操作：英文語系隱藏未對應中文選單的頁；關閉自動加入新頁；選單列不要用 More 溢出。頁尾 LINE 與私隱／Cookies 分兩欄，不要用會重疊的絕對定位。</w:t>
+      </w:r>
+    </w:p>
+    <w:p>
+      <w:pPr>
+        <w:pStyle w:val="Heading1"/>
+      </w:pPr>
+      <w:r>
+        <w:rPr>
+          <w:rFonts w:ascii="Calibri" w:hAnsi="Calibri" w:eastAsia="Microsoft JhengHei"/>
+          <w:b/>
+          <w:color w:val="12353A"/>
+          <w:sz w:val="32"/>
+        </w:rPr>
+        <w:t>3. 必須改掉的錯誤（臨床／品牌）</w:t>
       </w:r>
     </w:p>
     <w:tbl>
@@ -1511,6 +2121,402 @@
           </w:p>
         </w:tc>
       </w:tr>
+      <w:tr>
+        <w:tc>
+          <w:tcPr>
+            <w:tcW w:type="dxa" w:w="1474"/>
+          </w:tcPr>
+          <w:p>
+            <w:r/>
+            <w:r>
+              <w:rPr>
+                <w:rFonts w:ascii="Calibri" w:hAnsi="Calibri" w:eastAsia="Microsoft JhengHei"/>
+                <w:b w:val="0"/>
+                <w:sz w:val="20"/>
+              </w:rPr>
+              <w:t>頂層選單</w:t>
+            </w:r>
+          </w:p>
+        </w:tc>
+        <w:tc>
+          <w:tcPr>
+            <w:tcW w:type="dxa" w:w="2608"/>
+          </w:tcPr>
+          <w:p>
+            <w:r/>
+            <w:r>
+              <w:rPr>
+                <w:rFonts w:ascii="Calibri" w:hAnsi="Calibri" w:eastAsia="Microsoft JhengHei"/>
+                <w:b w:val="0"/>
+                <w:sz w:val="20"/>
+              </w:rPr>
+              <w:t>新網頁（連到報名系統）</w:t>
+            </w:r>
+          </w:p>
+        </w:tc>
+        <w:tc>
+          <w:tcPr>
+            <w:tcW w:type="dxa" w:w="2494"/>
+          </w:tcPr>
+          <w:p>
+            <w:r/>
+            <w:r>
+              <w:rPr>
+                <w:rFonts w:ascii="Calibri" w:hAnsi="Calibri" w:eastAsia="Microsoft JhengHei"/>
+                <w:b w:val="0"/>
+                <w:sz w:val="20"/>
+              </w:rPr>
+              <w:t>刪除。中文版沒有此項</w:t>
+            </w:r>
+          </w:p>
+        </w:tc>
+        <w:tc>
+          <w:tcPr>
+            <w:tcW w:type="dxa" w:w="3061"/>
+          </w:tcPr>
+          <w:p>
+            <w:r/>
+            <w:r>
+              <w:rPr>
+                <w:rFonts w:ascii="Calibri" w:hAnsi="Calibri" w:eastAsia="Microsoft JhengHei"/>
+                <w:b w:val="0"/>
+                <w:sz w:val="20"/>
+              </w:rPr>
+              <w:t>Wix 多語系把未上架頁加進英文選單。</w:t>
+            </w:r>
+          </w:p>
+        </w:tc>
+      </w:tr>
+      <w:tr>
+        <w:tc>
+          <w:tcPr>
+            <w:tcW w:type="dxa" w:w="1474"/>
+          </w:tcPr>
+          <w:p>
+            <w:r/>
+            <w:r>
+              <w:rPr>
+                <w:rFonts w:ascii="Calibri" w:hAnsi="Calibri" w:eastAsia="Microsoft JhengHei"/>
+                <w:b w:val="0"/>
+                <w:sz w:val="20"/>
+              </w:rPr>
+              <w:t>頂層選單</w:t>
+            </w:r>
+          </w:p>
+        </w:tc>
+        <w:tc>
+          <w:tcPr>
+            <w:tcW w:type="dxa" w:w="2608"/>
+          </w:tcPr>
+          <w:p>
+            <w:r/>
+            <w:r>
+              <w:rPr>
+                <w:rFonts w:ascii="Calibri" w:hAnsi="Calibri" w:eastAsia="Microsoft JhengHei"/>
+                <w:b w:val="0"/>
+                <w:sz w:val="20"/>
+              </w:rPr>
+              <w:t>兩個額外「關於」（友善連結／條款）</w:t>
+            </w:r>
+          </w:p>
+        </w:tc>
+        <w:tc>
+          <w:tcPr>
+            <w:tcW w:type="dxa" w:w="2494"/>
+          </w:tcPr>
+          <w:p>
+            <w:r/>
+            <w:r>
+              <w:rPr>
+                <w:rFonts w:ascii="Calibri" w:hAnsi="Calibri" w:eastAsia="Microsoft JhengHei"/>
+                <w:b w:val="0"/>
+                <w:sz w:val="20"/>
+              </w:rPr>
+              <w:t>刪除。條款只放頁尾；友善連結用 Useful links</w:t>
+            </w:r>
+          </w:p>
+        </w:tc>
+        <w:tc>
+          <w:tcPr>
+            <w:tcW w:type="dxa" w:w="3061"/>
+          </w:tcPr>
+          <w:p>
+            <w:r/>
+            <w:r>
+              <w:rPr>
+                <w:rFonts w:ascii="Calibri" w:hAnsi="Calibri" w:eastAsia="Microsoft JhengHei"/>
+                <w:b w:val="0"/>
+                <w:sz w:val="20"/>
+              </w:rPr>
+              <w:t>More 裡出現兩個關於，即因此。</w:t>
+            </w:r>
+          </w:p>
+        </w:tc>
+      </w:tr>
+      <w:tr>
+        <w:tc>
+          <w:tcPr>
+            <w:tcW w:type="dxa" w:w="1474"/>
+          </w:tcPr>
+          <w:p>
+            <w:r/>
+            <w:r>
+              <w:rPr>
+                <w:rFonts w:ascii="Calibri" w:hAnsi="Calibri" w:eastAsia="Microsoft JhengHei"/>
+                <w:b w:val="0"/>
+                <w:sz w:val="20"/>
+              </w:rPr>
+              <w:t>頂層選單</w:t>
+            </w:r>
+          </w:p>
+        </w:tc>
+        <w:tc>
+          <w:tcPr>
+            <w:tcW w:type="dxa" w:w="2608"/>
+          </w:tcPr>
+          <w:p>
+            <w:r/>
+            <w:r>
+              <w:rPr>
+                <w:rFonts w:ascii="Calibri" w:hAnsi="Calibri" w:eastAsia="Microsoft JhengHei"/>
+                <w:b w:val="0"/>
+                <w:sz w:val="20"/>
+              </w:rPr>
+              <w:t>搜尋結果 + More</w:t>
+            </w:r>
+          </w:p>
+        </w:tc>
+        <w:tc>
+          <w:tcPr>
+            <w:tcW w:type="dxa" w:w="2494"/>
+          </w:tcPr>
+          <w:p>
+            <w:r/>
+            <w:r>
+              <w:rPr>
+                <w:rFonts w:ascii="Calibri" w:hAnsi="Calibri" w:eastAsia="Microsoft JhengHei"/>
+                <w:b w:val="0"/>
+                <w:sz w:val="20"/>
+              </w:rPr>
+              <w:t>刪除。中文版沒有搜尋項；More 是溢出選單</w:t>
+            </w:r>
+          </w:p>
+        </w:tc>
+        <w:tc>
+          <w:tcPr>
+            <w:tcW w:type="dxa" w:w="3061"/>
+          </w:tcPr>
+          <w:p>
+            <w:r/>
+            <w:r>
+              <w:rPr>
+                <w:rFonts w:ascii="Calibri" w:hAnsi="Calibri" w:eastAsia="Microsoft JhengHei"/>
+                <w:b w:val="0"/>
+                <w:sz w:val="20"/>
+              </w:rPr>
+              <w:t>英文標籤較長，Wix 把多出的項推進 More。</w:t>
+            </w:r>
+          </w:p>
+        </w:tc>
+      </w:tr>
+      <w:tr>
+        <w:tc>
+          <w:tcPr>
+            <w:tcW w:type="dxa" w:w="1474"/>
+          </w:tcPr>
+          <w:p>
+            <w:r/>
+            <w:r>
+              <w:rPr>
+                <w:rFonts w:ascii="Calibri" w:hAnsi="Calibri" w:eastAsia="Microsoft JhengHei"/>
+                <w:b w:val="0"/>
+                <w:sz w:val="20"/>
+              </w:rPr>
+              <w:t>關於MPN 下拉</w:t>
+            </w:r>
+          </w:p>
+        </w:tc>
+        <w:tc>
+          <w:tcPr>
+            <w:tcW w:type="dxa" w:w="2608"/>
+          </w:tcPr>
+          <w:p>
+            <w:r/>
+            <w:r>
+              <w:rPr>
+                <w:rFonts w:ascii="Calibri" w:hAnsi="Calibri" w:eastAsia="Microsoft JhengHei"/>
+                <w:b w:val="0"/>
+                <w:sz w:val="20"/>
+              </w:rPr>
+              <w:t>血液數據怎麼看／什麼是MPN？／真性紅血球增生症…（全中文）</w:t>
+            </w:r>
+          </w:p>
+        </w:tc>
+        <w:tc>
+          <w:tcPr>
+            <w:tcW w:type="dxa" w:w="2494"/>
+          </w:tcPr>
+          <w:p>
+            <w:r/>
+            <w:r>
+              <w:rPr>
+                <w:rFonts w:ascii="Calibri" w:hAnsi="Calibri" w:eastAsia="Microsoft JhengHei"/>
+                <w:b w:val="0"/>
+                <w:sz w:val="20"/>
+              </w:rPr>
+              <w:t>How to read blood results / What is MPN? / Polycythemia vera (PV) / Essential thrombocythemia (ET) / Primary myelofibrosis (PMF)</w:t>
+            </w:r>
+          </w:p>
+        </w:tc>
+        <w:tc>
+          <w:tcPr>
+            <w:tcW w:type="dxa" w:w="3061"/>
+          </w:tcPr>
+          <w:p>
+            <w:r/>
+            <w:r>
+              <w:rPr>
+                <w:rFonts w:ascii="Calibri" w:hAnsi="Calibri" w:eastAsia="Microsoft JhengHei"/>
+                <w:b w:val="0"/>
+                <w:sz w:val="20"/>
+              </w:rPr>
+              <w:t>下拉必須與中文版同一 5 項，並譯成英文。</w:t>
+            </w:r>
+          </w:p>
+        </w:tc>
+      </w:tr>
+      <w:tr>
+        <w:tc>
+          <w:tcPr>
+            <w:tcW w:type="dxa" w:w="1474"/>
+          </w:tcPr>
+          <w:p>
+            <w:r/>
+            <w:r>
+              <w:rPr>
+                <w:rFonts w:ascii="Calibri" w:hAnsi="Calibri" w:eastAsia="Microsoft JhengHei"/>
+                <w:b w:val="0"/>
+                <w:sz w:val="20"/>
+              </w:rPr>
+              <w:t>衛教下拉（現標成「關於」）</w:t>
+            </w:r>
+          </w:p>
+        </w:tc>
+        <w:tc>
+          <w:tcPr>
+            <w:tcW w:type="dxa" w:w="2608"/>
+          </w:tcPr>
+          <w:p>
+            <w:r/>
+            <w:r>
+              <w:rPr>
+                <w:rFonts w:ascii="Calibri" w:hAnsi="Calibri" w:eastAsia="Microsoft JhengHei"/>
+                <w:b w:val="0"/>
+                <w:sz w:val="20"/>
+              </w:rPr>
+              <w:t>副本 副本 衛教手冊／副本 衛教手冊／副本 認識紅血球增多症</w:t>
+            </w:r>
+          </w:p>
+        </w:tc>
+        <w:tc>
+          <w:tcPr>
+            <w:tcW w:type="dxa" w:w="2494"/>
+          </w:tcPr>
+          <w:p>
+            <w:r/>
+            <w:r>
+              <w:rPr>
+                <w:rFonts w:ascii="Calibri" w:hAnsi="Calibri" w:eastAsia="Microsoft JhengHei"/>
+                <w:b w:val="0"/>
+                <w:sz w:val="20"/>
+              </w:rPr>
+              <w:t>Patient education▾：Myeloproliferative neoplasms / Understanding polycythemia vera / Understanding essential thrombocythemia / Patient stories</w:t>
+            </w:r>
+          </w:p>
+        </w:tc>
+        <w:tc>
+          <w:tcPr>
+            <w:tcW w:type="dxa" w:w="3061"/>
+          </w:tcPr>
+          <w:p>
+            <w:r/>
+            <w:r>
+              <w:rPr>
+                <w:rFonts w:ascii="Calibri" w:hAnsi="Calibri" w:eastAsia="Microsoft JhengHei"/>
+                <w:b w:val="0"/>
+                <w:sz w:val="20"/>
+              </w:rPr>
+              <w:t>清掉 Wix「副本」頁名；不要把衛教專區譯成 About。</w:t>
+            </w:r>
+          </w:p>
+        </w:tc>
+      </w:tr>
+      <w:tr>
+        <w:tc>
+          <w:tcPr>
+            <w:tcW w:type="dxa" w:w="1474"/>
+          </w:tcPr>
+          <w:p>
+            <w:r/>
+            <w:r>
+              <w:rPr>
+                <w:rFonts w:ascii="Calibri" w:hAnsi="Calibri" w:eastAsia="Microsoft JhengHei"/>
+                <w:b w:val="0"/>
+                <w:sz w:val="20"/>
+              </w:rPr>
+              <w:t>頁尾排版</w:t>
+            </w:r>
+          </w:p>
+        </w:tc>
+        <w:tc>
+          <w:tcPr>
+            <w:tcW w:type="dxa" w:w="2608"/>
+          </w:tcPr>
+          <w:p>
+            <w:r/>
+            <w:r>
+              <w:rPr>
+                <w:rFonts w:ascii="Calibri" w:hAnsi="Calibri" w:eastAsia="Microsoft JhengHei"/>
+                <w:b w:val="0"/>
+                <w:sz w:val="20"/>
+              </w:rPr>
+              <w:t>LINE 歡迎句與 cookies／私隱政策重疊</w:t>
+            </w:r>
+          </w:p>
+        </w:tc>
+        <w:tc>
+          <w:tcPr>
+            <w:tcW w:type="dxa" w:w="2494"/>
+          </w:tcPr>
+          <w:p>
+            <w:r/>
+            <w:r>
+              <w:rPr>
+                <w:rFonts w:ascii="Calibri" w:hAnsi="Calibri" w:eastAsia="Microsoft JhengHei"/>
+                <w:b w:val="0"/>
+                <w:sz w:val="20"/>
+              </w:rPr>
+              <w:t>LINE 改短句並獨立一欄：Official MPN LINE / Latest updates</w:t>
+            </w:r>
+          </w:p>
+        </w:tc>
+        <w:tc>
+          <w:tcPr>
+            <w:tcW w:type="dxa" w:w="3061"/>
+          </w:tcPr>
+          <w:p>
+            <w:r/>
+            <w:r>
+              <w:rPr>
+                <w:rFonts w:ascii="Calibri" w:hAnsi="Calibri" w:eastAsia="Microsoft JhengHei"/>
+                <w:b w:val="0"/>
+                <w:sz w:val="20"/>
+              </w:rPr>
+              <w:t>英文比中文長，Wix 絕對定位會撞字。</w:t>
+            </w:r>
+          </w:p>
+        </w:tc>
+      </w:tr>
     </w:tbl>
     <w:p/>
     <w:p>
@@ -1524,7 +2530,7 @@
           <w:color w:val="12353A"/>
           <w:sz w:val="32"/>
         </w:rPr>
-        <w:t>3. 首頁建議英文（可直接貼上 Wix）</w:t>
+        <w:t>4. 首頁建議英文（可直接貼上 Wix）</w:t>
       </w:r>
     </w:p>
     <w:p>
@@ -1590,7 +2596,7 @@
           <w:color w:val="12353A"/>
           <w:sz w:val="32"/>
         </w:rPr>
-        <w:t>4. 關於MPN 建議英文</w:t>
+        <w:t>5. 關於MPN 建議英文</w:t>
       </w:r>
     </w:p>
     <w:p>
@@ -1682,7 +2688,7 @@
           <w:color w:val="12353A"/>
           <w:sz w:val="32"/>
         </w:rPr>
-        <w:t>5. 頁尾／選單建議</w:t>
+        <w:t>6. 頁尾／選單建議</w:t>
       </w:r>
     </w:p>
     <w:tbl>
@@ -1832,7 +2838,7 @@
                 <w:b w:val="0"/>
                 <w:sz w:val="20"/>
               </w:rPr>
-              <w:t>Join the official MPN Line account / We will provide you with the latest information.</w:t>
+              <w:t>Join the official MPN Line account / We will provide you with the latest information.（與私隱政策重疊）</w:t>
             </w:r>
           </w:p>
         </w:tc>
@@ -1848,7 +2854,7 @@
                 <w:b w:val="0"/>
                 <w:sz w:val="20"/>
               </w:rPr>
-              <w:t>Add the official MPN LINE account / We will send you the latest updates.</w:t>
+              <w:t>Official MPN LINE / Latest updates（獨立右欄，不要蓋住條款）</w:t>
             </w:r>
           </w:p>
         </w:tc>
@@ -1966,7 +2972,7 @@
           <w:color w:val="12353A"/>
           <w:sz w:val="32"/>
         </w:rPr>
-        <w:t>6. 不要改的範圍</w:t>
+        <w:t>7. 不要改的範圍</w:t>
       </w:r>
     </w:p>
     <w:p>
@@ -2032,7 +3038,7 @@
           <w:color w:val="12353A"/>
           <w:sz w:val="32"/>
         </w:rPr>
-        <w:t>7. 審閱負責人</w:t>
+        <w:t>8. 審閱負責人</w:t>
       </w:r>
     </w:p>
     <w:tbl>

</xml_diff>